<commit_message>
Platform migration: FiveM -> HELIX
- Updated Project Charter: platform is now HELIX Game Platform (UE + Lua)
  - Replaced 'GTA V FiveM Environment' references with 'HELIX Game Platform'
  - Replaced CFX.RE / Rockstar stakeholder with HELIX / nanos world
  - Replaced 'GTA 6 release' risk with 'HELIX API Breaking Changes'
- Updated WBS: replaced all FiveM framework references with HELIX equivalents
- Updated Risks & Mitigation: GTA 6 risk replaced with HELIX API stability risk
- Replaced fxmanifest.lua (cfx) in blips and peds packages with HELIX Package.toml
- Added Package.toml noting GTA V ped list incompatibility with HELIX asset pipeline
- GitHub project board: updated issues #6, #42, #69, #70 to HELIX terminology
- GitHub project board: added issues #78, #79, #82, #83 for HELIX migration tasks
</commit_message>
<xml_diff>
--- a/projectFiles/Project Charter.docx
+++ b/projectFiles/Project Charter.docx
@@ -1,6 +1,6 @@
 
 <file path=word/document.xml><?xml version="1.0" encoding="utf-8"?>
-<w:document xmlns:wpc="http://schemas.microsoft.com/office/word/2010/wordprocessingCanvas" xmlns:cx="http://schemas.microsoft.com/office/drawing/2014/chartex" xmlns:cx1="http://schemas.microsoft.com/office/drawing/2015/9/8/chartex" xmlns:cx2="http://schemas.microsoft.com/office/drawing/2015/10/21/chartex" xmlns:cx3="http://schemas.microsoft.com/office/drawing/2016/5/9/chartex" xmlns:cx4="http://schemas.microsoft.com/office/drawing/2016/5/10/chartex" xmlns:cx5="http://schemas.microsoft.com/office/drawing/2016/5/11/chartex" xmlns:cx6="http://schemas.microsoft.com/office/drawing/2016/5/12/chartex" xmlns:cx7="http://schemas.microsoft.com/office/drawing/2016/5/13/chartex" xmlns:cx8="http://schemas.microsoft.com/office/drawing/2016/5/14/chartex" xmlns:mc="http://schemas.openxmlformats.org/markup-compatibility/2006" xmlns:aink="http://schemas.microsoft.com/office/drawing/2016/ink" xmlns:am3d="http://schemas.microsoft.com/office/drawing/2017/model3d" xmlns:o="urn:schemas-microsoft-com:office:office" xmlns:oel="http://schemas.microsoft.com/office/2019/extlst" xmlns:r="http://schemas.openxmlformats.org/officeDocument/2006/relationships" xmlns:m="http://schemas.openxmlformats.org/officeDocument/2006/math" xmlns:v="urn:schemas-microsoft-com:vml" xmlns:wp14="http://schemas.microsoft.com/office/word/2010/wordprocessingDrawing" xmlns:wp="http://schemas.openxmlformats.org/drawingml/2006/wordprocessingDrawing" xmlns:w10="urn:schemas-microsoft-com:office:word" xmlns:w="http://schemas.openxmlformats.org/wordprocessingml/2006/main" xmlns:w14="http://schemas.microsoft.com/office/word/2010/wordml" xmlns:w15="http://schemas.microsoft.com/office/word/2012/wordml" xmlns:w16cex="http://schemas.microsoft.com/office/word/2018/wordml/cex" xmlns:w16cid="http://schemas.microsoft.com/office/word/2016/wordml/cid" xmlns:w16="http://schemas.microsoft.com/office/word/2018/wordml" xmlns:w16du="http://schemas.microsoft.com/office/word/2023/wordml/word16du" xmlns:w16sdtdh="http://schemas.microsoft.com/office/word/2020/wordml/sdtdatahash" xmlns:w16se="http://schemas.microsoft.com/office/word/2015/wordml/symex" xmlns:wpg="http://schemas.microsoft.com/office/word/2010/wordprocessingGroup" xmlns:wpi="http://schemas.microsoft.com/office/word/2010/wordprocessingInk" xmlns:wne="http://schemas.microsoft.com/office/word/2006/wordml" xmlns:wps="http://schemas.microsoft.com/office/word/2010/wordprocessingShape" mc:Ignorable="w14 w15 w16se w16cid w16 w16cex w16sdtdh w16du wp14">
+<w:document xmlns:wpc="http://schemas.microsoft.com/office/word/2010/wordprocessingCanvas" xmlns:cx="http://schemas.microsoft.com/office/drawing/2014/chartex" xmlns:cx1="http://schemas.microsoft.com/office/drawing/2015/9/8/chartex" xmlns:cx2="http://schemas.microsoft.com/office/drawing/2015/10/21/chartex" xmlns:cx3="http://schemas.microsoft.com/office/drawing/2016/5/9/chartex" xmlns:cx4="http://schemas.microsoft.com/office/drawing/2016/5/10/chartex" xmlns:cx5="http://schemas.microsoft.com/office/drawing/2016/5/11/chartex" xmlns:cx6="http://schemas.microsoft.com/office/drawing/2016/5/12/chartex" xmlns:cx7="http://schemas.microsoft.com/office/drawing/2016/5/13/chartex" xmlns:cx8="http://schemas.microsoft.com/office/drawing/2016/5/14/chartex" xmlns:mc="http://schemas.openxmlformats.org/markup-compatibility/2006" xmlns:aink="http://schemas.microsoft.com/office/drawing/2016/ink" xmlns:am3d="http://schemas.microsoft.com/office/drawing/2017/model3d" xmlns:o="urn:schemas-microsoft-com:office:office" xmlns:oel="http://schemas.microsoft.com/office/2019/extlst" xmlns:r="http://schemas.openxmlformats.org/officeDocument/2006/relationships" xmlns:m="http://schemas.openxmlformats.org/officeDocument/2006/math" xmlns:v="urn:schemas-microsoft-com:vml" xmlns:wp14="http://schemas.microsoft.com/office/word/2010/wordprocessingDrawing" xmlns:wp="http://schemas.openxmlformats.org/drawingml/2006/wordprocessingDrawing" xmlns:w10="urn:schemas-microsoft-com:office:word" xmlns:w="http://schemas.openxmlformats.org/wordprocessingml/2006/main" xmlns:w14="http://schemas.microsoft.com/office/word/2010/wordml" xmlns:w15="http://schemas.microsoft.com/office/word/2012/wordml" xmlns:w16cex="http://schemas.microsoft.com/office/word/2018/wordml/cex" xmlns:w16cid="http://schemas.microsoft.com/office/word/2016/wordml/cid" xmlns:w16="http://schemas.microsoft.com/office/word/2018/wordml" xmlns:w16du="http://schemas.microsoft.com/office/word/2023/wordml/word16du" xmlns:w16sdtdh="http://schemas.microsoft.com/office/word/2020/wordml/sdtdatahash" xmlns:w16sdtfl="http://schemas.microsoft.com/office/word/2024/wordml/sdtformatlock" xmlns:w16se="http://schemas.microsoft.com/office/word/2015/wordml/symex" xmlns:wpg="http://schemas.microsoft.com/office/word/2010/wordprocessingGroup" xmlns:wpi="http://schemas.microsoft.com/office/word/2010/wordprocessingInk" xmlns:wne="http://schemas.microsoft.com/office/word/2006/wordml" xmlns:wps="http://schemas.microsoft.com/office/word/2010/wordprocessingShape" mc:Ignorable="w14 w15 w16se w16cid w16 w16cex w16sdtdh w16sdtfl w16du wp14">
   <w:body>
     <w:tbl>
       <w:tblPr>
@@ -111,7 +111,7 @@
           </w:tcPr>
           <w:p>
             <w:r>
-              <w:t>Framework for the GTA V FiveM Environment</w:t>
+              <w:t>Framework for the HELIX Game Platform</w:t>
             </w:r>
           </w:p>
         </w:tc>
@@ -377,7 +377,13 @@
               <w:jc w:val="center"/>
             </w:pPr>
             <w:r>
-              <w:t xml:space="preserve">To provide a GTA V – FiveM Framework that is easy to use, easy to configure, engaging, and can be </w:t>
+              <w:t xml:space="preserve">To provide a </w:t>
+            </w:r>
+            <w:r>
+              <w:t>HELIX Framework that is easy to use</w:t>
+            </w:r>
+            <w:r>
+              <w:t xml:space="preserve">, easy to configure, engaging, and can be </w:t>
             </w:r>
             <w:r>
               <w:t>quickly</w:t>
@@ -461,13 +467,8 @@
               </w:numPr>
             </w:pPr>
             <w:r>
-              <w:t xml:space="preserve">Stick to the </w:t>
-            </w:r>
-            <w:proofErr w:type="spellStart"/>
-            <w:r>
-              <w:t>deliverablesMindMap.dia</w:t>
-            </w:r>
-            <w:proofErr w:type="spellEnd"/>
+              <w:t>Stick to the deliverablesMindMap.dia</w:t>
+            </w:r>
           </w:p>
           <w:p/>
         </w:tc>
@@ -578,7 +579,7 @@
               </w:numPr>
             </w:pPr>
             <w:r>
-              <w:t>GTA 6 release</w:t>
+              <w:t>HELIX API Breaking Changes</w:t>
             </w:r>
           </w:p>
         </w:tc>
@@ -1166,13 +1167,8 @@
               <w:jc w:val="center"/>
             </w:pPr>
             <w:r>
-              <w:t xml:space="preserve">Malka </w:t>
-            </w:r>
-            <w:proofErr w:type="spellStart"/>
-            <w:r>
-              <w:t>Farvo</w:t>
-            </w:r>
-            <w:proofErr w:type="spellEnd"/>
+              <w:t>Malka Farvo</w:t>
+            </w:r>
           </w:p>
         </w:tc>
         <w:tc>
@@ -1492,7 +1488,7 @@
               <w:jc w:val="center"/>
             </w:pPr>
             <w:r>
-              <w:t>CFX.RE / Rockstar</w:t>
+              <w:t>HELIX / nanos world</w:t>
             </w:r>
           </w:p>
         </w:tc>
@@ -1541,7 +1537,7 @@
 </file>
 
 <file path=word/numbering.xml><?xml version="1.0" encoding="utf-8"?>
-<w:numbering xmlns:wpc="http://schemas.microsoft.com/office/word/2010/wordprocessingCanvas" xmlns:cx="http://schemas.microsoft.com/office/drawing/2014/chartex" xmlns:cx1="http://schemas.microsoft.com/office/drawing/2015/9/8/chartex" xmlns:cx2="http://schemas.microsoft.com/office/drawing/2015/10/21/chartex" xmlns:cx3="http://schemas.microsoft.com/office/drawing/2016/5/9/chartex" xmlns:cx4="http://schemas.microsoft.com/office/drawing/2016/5/10/chartex" xmlns:cx5="http://schemas.microsoft.com/office/drawing/2016/5/11/chartex" xmlns:cx6="http://schemas.microsoft.com/office/drawing/2016/5/12/chartex" xmlns:cx7="http://schemas.microsoft.com/office/drawing/2016/5/13/chartex" xmlns:cx8="http://schemas.microsoft.com/office/drawing/2016/5/14/chartex" xmlns:mc="http://schemas.openxmlformats.org/markup-compatibility/2006" xmlns:aink="http://schemas.microsoft.com/office/drawing/2016/ink" xmlns:am3d="http://schemas.microsoft.com/office/drawing/2017/model3d" xmlns:o="urn:schemas-microsoft-com:office:office" xmlns:oel="http://schemas.microsoft.com/office/2019/extlst" xmlns:r="http://schemas.openxmlformats.org/officeDocument/2006/relationships" xmlns:m="http://schemas.openxmlformats.org/officeDocument/2006/math" xmlns:v="urn:schemas-microsoft-com:vml" xmlns:wp14="http://schemas.microsoft.com/office/word/2010/wordprocessingDrawing" xmlns:wp="http://schemas.openxmlformats.org/drawingml/2006/wordprocessingDrawing" xmlns:w10="urn:schemas-microsoft-com:office:word" xmlns:w="http://schemas.openxmlformats.org/wordprocessingml/2006/main" xmlns:w14="http://schemas.microsoft.com/office/word/2010/wordml" xmlns:w15="http://schemas.microsoft.com/office/word/2012/wordml" xmlns:w16cex="http://schemas.microsoft.com/office/word/2018/wordml/cex" xmlns:w16cid="http://schemas.microsoft.com/office/word/2016/wordml/cid" xmlns:w16="http://schemas.microsoft.com/office/word/2018/wordml" xmlns:w16du="http://schemas.microsoft.com/office/word/2023/wordml/word16du" xmlns:w16sdtdh="http://schemas.microsoft.com/office/word/2020/wordml/sdtdatahash" xmlns:w16se="http://schemas.microsoft.com/office/word/2015/wordml/symex" xmlns:wpg="http://schemas.microsoft.com/office/word/2010/wordprocessingGroup" xmlns:wpi="http://schemas.microsoft.com/office/word/2010/wordprocessingInk" xmlns:wne="http://schemas.microsoft.com/office/word/2006/wordml" xmlns:wps="http://schemas.microsoft.com/office/word/2010/wordprocessingShape" mc:Ignorable="w14 w15 w16se w16cid w16 w16cex w16sdtdh w16du wp14">
+<w:numbering xmlns:wpc="http://schemas.microsoft.com/office/word/2010/wordprocessingCanvas" xmlns:cx="http://schemas.microsoft.com/office/drawing/2014/chartex" xmlns:cx1="http://schemas.microsoft.com/office/drawing/2015/9/8/chartex" xmlns:cx2="http://schemas.microsoft.com/office/drawing/2015/10/21/chartex" xmlns:cx3="http://schemas.microsoft.com/office/drawing/2016/5/9/chartex" xmlns:cx4="http://schemas.microsoft.com/office/drawing/2016/5/10/chartex" xmlns:cx5="http://schemas.microsoft.com/office/drawing/2016/5/11/chartex" xmlns:cx6="http://schemas.microsoft.com/office/drawing/2016/5/12/chartex" xmlns:cx7="http://schemas.microsoft.com/office/drawing/2016/5/13/chartex" xmlns:cx8="http://schemas.microsoft.com/office/drawing/2016/5/14/chartex" xmlns:mc="http://schemas.openxmlformats.org/markup-compatibility/2006" xmlns:aink="http://schemas.microsoft.com/office/drawing/2016/ink" xmlns:am3d="http://schemas.microsoft.com/office/drawing/2017/model3d" xmlns:o="urn:schemas-microsoft-com:office:office" xmlns:oel="http://schemas.microsoft.com/office/2019/extlst" xmlns:r="http://schemas.openxmlformats.org/officeDocument/2006/relationships" xmlns:m="http://schemas.openxmlformats.org/officeDocument/2006/math" xmlns:v="urn:schemas-microsoft-com:vml" xmlns:wp14="http://schemas.microsoft.com/office/word/2010/wordprocessingDrawing" xmlns:wp="http://schemas.openxmlformats.org/drawingml/2006/wordprocessingDrawing" xmlns:w10="urn:schemas-microsoft-com:office:word" xmlns:w="http://schemas.openxmlformats.org/wordprocessingml/2006/main" xmlns:w14="http://schemas.microsoft.com/office/word/2010/wordml" xmlns:w15="http://schemas.microsoft.com/office/word/2012/wordml" xmlns:w16cex="http://schemas.microsoft.com/office/word/2018/wordml/cex" xmlns:w16cid="http://schemas.microsoft.com/office/word/2016/wordml/cid" xmlns:w16="http://schemas.microsoft.com/office/word/2018/wordml" xmlns:w16du="http://schemas.microsoft.com/office/word/2023/wordml/word16du" xmlns:w16sdtdh="http://schemas.microsoft.com/office/word/2020/wordml/sdtdatahash" xmlns:w16sdtfl="http://schemas.microsoft.com/office/word/2024/wordml/sdtformatlock" xmlns:w16se="http://schemas.microsoft.com/office/word/2015/wordml/symex" xmlns:wpg="http://schemas.microsoft.com/office/word/2010/wordprocessingGroup" xmlns:wpi="http://schemas.microsoft.com/office/word/2010/wordprocessingInk" xmlns:wne="http://schemas.microsoft.com/office/word/2006/wordml" xmlns:wps="http://schemas.microsoft.com/office/word/2010/wordprocessingShape" mc:Ignorable="w14 w15 w16se w16cid w16 w16cex w16sdtdh w16sdtfl w16du wp14">
   <w:abstractNum w:abstractNumId="0" w15:restartNumberingAfterBreak="0">
     <w:nsid w:val="13607CBF"/>
     <w:multiLevelType w:val="hybridMultilevel"/>
@@ -1894,7 +1890,7 @@
 </file>
 
 <file path=word/styles.xml><?xml version="1.0" encoding="utf-8"?>
-<w:styles xmlns:mc="http://schemas.openxmlformats.org/markup-compatibility/2006" xmlns:r="http://schemas.openxmlformats.org/officeDocument/2006/relationships" xmlns:w="http://schemas.openxmlformats.org/wordprocessingml/2006/main" xmlns:w14="http://schemas.microsoft.com/office/word/2010/wordml" xmlns:w15="http://schemas.microsoft.com/office/word/2012/wordml" xmlns:w16cex="http://schemas.microsoft.com/office/word/2018/wordml/cex" xmlns:w16cid="http://schemas.microsoft.com/office/word/2016/wordml/cid" xmlns:w16="http://schemas.microsoft.com/office/word/2018/wordml" xmlns:w16du="http://schemas.microsoft.com/office/word/2023/wordml/word16du" xmlns:w16sdtdh="http://schemas.microsoft.com/office/word/2020/wordml/sdtdatahash" xmlns:w16se="http://schemas.microsoft.com/office/word/2015/wordml/symex" mc:Ignorable="w14 w15 w16se w16cid w16 w16cex w16sdtdh w16du">
+<w:styles xmlns:mc="http://schemas.openxmlformats.org/markup-compatibility/2006" xmlns:r="http://schemas.openxmlformats.org/officeDocument/2006/relationships" xmlns:w="http://schemas.openxmlformats.org/wordprocessingml/2006/main" xmlns:w14="http://schemas.microsoft.com/office/word/2010/wordml" xmlns:w15="http://schemas.microsoft.com/office/word/2012/wordml" xmlns:w16cex="http://schemas.microsoft.com/office/word/2018/wordml/cex" xmlns:w16cid="http://schemas.microsoft.com/office/word/2016/wordml/cid" xmlns:w16="http://schemas.microsoft.com/office/word/2018/wordml" xmlns:w16du="http://schemas.microsoft.com/office/word/2023/wordml/word16du" xmlns:w16sdtdh="http://schemas.microsoft.com/office/word/2020/wordml/sdtdatahash" xmlns:w16sdtfl="http://schemas.microsoft.com/office/word/2024/wordml/sdtformatlock" xmlns:w16se="http://schemas.microsoft.com/office/word/2015/wordml/symex" mc:Ignorable="w14 w15 w16se w16cid w16 w16cex w16sdtdh w16sdtfl w16du">
   <w:docDefaults>
     <w:rPrDefault>
       <w:rPr>

</xml_diff>